<commit_message>
Hoan thanh 7 loai hop dong
</commit_message>
<xml_diff>
--- a/src/main/resources/templates/BaoCaoDeNghiGiaiNganKiemGiayNhanNo.docx
+++ b/src/main/resources/templates/BaoCaoDeNghiGiaiNganKiemGiayNhanNo.docx
@@ -133,7 +133,15 @@
           <w:i/>
           <w:sz w:val="28"/>
         </w:rPr>
-        <w:t>Chu Văn An, ngày 09 tháng 01 năm 2026</w:t>
+        <w:t>{{phuong}}</w:t>
+      </w:r>
+      <w:r>
+        <w:rPr>
+          <w:rFonts w:ascii="Times New Roman" w:hAnsi="Times New Roman"/>
+          <w:i/>
+          <w:sz w:val="28"/>
+        </w:rPr>
+        <w:t>, ngày 09 tháng 01 năm 2026</w:t>
       </w:r>
     </w:p>
     <w:p>
@@ -221,12 +229,28 @@
           <w:sz w:val="28"/>
         </w:rPr>
       </w:pPr>
-      <w:r>
-        <w:rPr>
-          <w:rFonts w:ascii="Times New Roman" w:hAnsi="Times New Roman"/>
-          <w:sz w:val="28"/>
-        </w:rPr>
-        <w:t>Họ và tên người nhận nợ: {{kh}}</w:t>
+      <w:bookmarkStart w:id="0" w:name="_GoBack"/>
+      <w:r>
+        <w:rPr>
+          <w:rFonts w:ascii="Times New Roman" w:hAnsi="Times New Roman"/>
+          <w:sz w:val="28"/>
+        </w:rPr>
+        <w:t>Họ và tên người nhận nợ</w:t>
+      </w:r>
+      <w:r>
+        <w:rPr>
+          <w:rFonts w:ascii="Times New Roman" w:hAnsi="Times New Roman"/>
+          <w:sz w:val="28"/>
+        </w:rPr>
+        <w:t xml:space="preserve">: </w:t>
+      </w:r>
+      <w:r>
+        <w:rPr>
+          <w:rFonts w:ascii="Times New Roman" w:hAnsi="Times New Roman"/>
+          <w:b/>
+          <w:sz w:val="28"/>
+        </w:rPr>
+        <w:t>{{kh}}</w:t>
       </w:r>
       <w:r>
         <w:rPr>
@@ -236,6 +260,7 @@
         <w:t>.</w:t>
       </w:r>
     </w:p>
+    <w:bookmarkEnd w:id="0"/>
     <w:p>
       <w:pPr>
         <w:pStyle w:val="ListParagraph"/>
@@ -323,14 +348,14 @@
           <w:rFonts w:ascii="Times New Roman" w:hAnsi="Times New Roman"/>
           <w:sz w:val="28"/>
         </w:rPr>
-        <w:t>p: {{nc</w:t>
-      </w:r>
-      <w:r>
-        <w:rPr>
-          <w:rFonts w:ascii="Times New Roman" w:hAnsi="Times New Roman"/>
-          <w:sz w:val="28"/>
-        </w:rPr>
-        <w:t>kh}}.</w:t>
+        <w:t>p: {{nckh}}</w:t>
+      </w:r>
+      <w:r>
+        <w:rPr>
+          <w:rFonts w:ascii="Times New Roman" w:hAnsi="Times New Roman"/>
+          <w:sz w:val="28"/>
+        </w:rPr>
+        <w:t>.</w:t>
       </w:r>
       <w:r>
         <w:rPr>
@@ -388,7 +413,15 @@
           <w:rFonts w:ascii="Times New Roman" w:hAnsi="Times New Roman"/>
           <w:sz w:val="28"/>
         </w:rPr>
-        <w:t>Và ông/bà: {{ntkh}}</w:t>
+        <w:t xml:space="preserve">Và ông/bà: </w:t>
+      </w:r>
+      <w:r>
+        <w:rPr>
+          <w:rFonts w:ascii="Times New Roman" w:hAnsi="Times New Roman"/>
+          <w:b/>
+          <w:sz w:val="28"/>
+        </w:rPr>
+        <w:t>{{ntkh}}</w:t>
       </w:r>
       <w:r>
         <w:rPr>
@@ -402,21 +435,14 @@
           <w:rFonts w:ascii="Times New Roman" w:hAnsi="Times New Roman"/>
           <w:sz w:val="28"/>
         </w:rPr>
-        <w:t>Sinh ngày: {{</w:t>
-      </w:r>
-      <w:r>
-        <w:rPr>
-          <w:rFonts w:ascii="Times New Roman" w:hAnsi="Times New Roman"/>
-          <w:sz w:val="28"/>
-        </w:rPr>
-        <w:t>nsnt</w:t>
-      </w:r>
-      <w:r>
-        <w:rPr>
-          <w:rFonts w:ascii="Times New Roman" w:hAnsi="Times New Roman"/>
-          <w:sz w:val="28"/>
-        </w:rPr>
-        <w:t>}}.</w:t>
+        <w:t>Sinh ngày: {{nsnt}}</w:t>
+      </w:r>
+      <w:r>
+        <w:rPr>
+          <w:rFonts w:ascii="Times New Roman" w:hAnsi="Times New Roman"/>
+          <w:sz w:val="28"/>
+        </w:rPr>
+        <w:t>.</w:t>
       </w:r>
     </w:p>
     <w:p>
@@ -440,14 +466,7 @@
           <w:rFonts w:ascii="Times New Roman" w:hAnsi="Times New Roman"/>
           <w:sz w:val="28"/>
         </w:rPr>
-        <w:t xml:space="preserve"> CC/CCCD: {{</w:t>
-      </w:r>
-      <w:r>
-        <w:rPr>
-          <w:rFonts w:ascii="Times New Roman" w:hAnsi="Times New Roman"/>
-          <w:sz w:val="28"/>
-        </w:rPr>
-        <w:t>cccdnt}}</w:t>
+        <w:t xml:space="preserve"> CC/CCCD: {{cccdnt}}</w:t>
       </w:r>
       <w:r>
         <w:rPr>
@@ -456,8 +475,6 @@
         </w:rPr>
         <w:t xml:space="preserve">                          </w:t>
       </w:r>
-      <w:bookmarkStart w:id="0" w:name="_GoBack"/>
-      <w:bookmarkEnd w:id="0"/>
       <w:r>
         <w:rPr>
           <w:rFonts w:ascii="Times New Roman" w:hAnsi="Times New Roman"/>
@@ -470,14 +487,14 @@
           <w:rFonts w:ascii="Times New Roman" w:hAnsi="Times New Roman"/>
           <w:sz w:val="28"/>
         </w:rPr>
-        <w:t>p: {{nc</w:t>
-      </w:r>
-      <w:r>
-        <w:rPr>
-          <w:rFonts w:ascii="Times New Roman" w:hAnsi="Times New Roman"/>
-          <w:sz w:val="28"/>
-        </w:rPr>
-        <w:t>nt}}.</w:t>
+        <w:t>p: {{ncnt}}</w:t>
+      </w:r>
+      <w:r>
+        <w:rPr>
+          <w:rFonts w:ascii="Times New Roman" w:hAnsi="Times New Roman"/>
+          <w:sz w:val="28"/>
+        </w:rPr>
+        <w:t>.</w:t>
       </w:r>
     </w:p>
     <w:p>
@@ -552,14 +569,14 @@
           <w:rFonts w:ascii="Times New Roman" w:hAnsi="Times New Roman"/>
           <w:sz w:val="28"/>
         </w:rPr>
-        <w:t xml:space="preserve">Thời gian vay {{thv}} </w:t>
-      </w:r>
-      <w:r>
-        <w:rPr>
-          <w:rFonts w:ascii="Times New Roman" w:hAnsi="Times New Roman"/>
-          <w:sz w:val="28"/>
-        </w:rPr>
-        <w:t>(kể từ ngày {{day}}/{{month}}/{{year}} đến ngày {{nkt}}.</w:t>
+        <w:t>Thờ</w:t>
+      </w:r>
+      <w:r>
+        <w:rPr>
+          <w:rFonts w:ascii="Times New Roman" w:hAnsi="Times New Roman"/>
+          <w:sz w:val="28"/>
+        </w:rPr>
+        <w:t>i gian vay {{thv}} năm.</w:t>
       </w:r>
     </w:p>
     <w:p>
@@ -785,7 +802,14 @@
           <w:rFonts w:ascii="Times New Roman" w:hAnsi="Times New Roman"/>
           <w:sz w:val="28"/>
         </w:rPr>
-        <w:t xml:space="preserve">Tôi: Vũ Xuân Long </w:t>
+        <w:t>Tôi: {{canBoTDVT}}</w:t>
+      </w:r>
+      <w:r>
+        <w:rPr>
+          <w:rFonts w:ascii="Times New Roman" w:hAnsi="Times New Roman"/>
+          <w:sz w:val="28"/>
+        </w:rPr>
+        <w:t xml:space="preserve"> </w:t>
       </w:r>
       <w:r>
         <w:rPr>
@@ -814,7 +838,6 @@
           <w:b/>
           <w:sz w:val="28"/>
         </w:rPr>
-        <w:lastRenderedPageBreak/>
         <w:t>NHẬN NỢ</w:t>
       </w:r>
     </w:p>
@@ -835,6 +858,7 @@
           <w:rFonts w:ascii="Times New Roman" w:hAnsi="Times New Roman"/>
           <w:sz w:val="28"/>
         </w:rPr>
+        <w:lastRenderedPageBreak/>
         <w:t>Hợp đồng cho vay số: {{shdtd}} ký ngày {{day}}/{{month}}/{{year}}.</w:t>
       </w:r>
     </w:p>
@@ -986,7 +1010,14 @@
           <w:rFonts w:ascii="Times New Roman" w:hAnsi="Times New Roman"/>
           <w:sz w:val="28"/>
         </w:rPr>
-        <w:t>Thời hạn vay: {{hm}} ngày trả nợ cuối cùng {{nkt}}.</w:t>
+        <w:t xml:space="preserve">Thời hạn vay: </w:t>
+      </w:r>
+      <w:r>
+        <w:rPr>
+          <w:rFonts w:ascii="Times New Roman" w:hAnsi="Times New Roman"/>
+          <w:sz w:val="28"/>
+        </w:rPr>
+        <w:t>{{thv}} năm.</w:t>
       </w:r>
     </w:p>
     <w:p>
@@ -1251,6 +1282,51 @@
           <w:sz w:val="28"/>
         </w:rPr>
         <w:tab/>
+      </w:r>
+    </w:p>
+    <w:p>
+      <w:pPr>
+        <w:rPr>
+          <w:rFonts w:ascii="Times New Roman" w:hAnsi="Times New Roman"/>
+          <w:i/>
+          <w:sz w:val="28"/>
+        </w:rPr>
+      </w:pPr>
+    </w:p>
+    <w:p>
+      <w:pPr>
+        <w:rPr>
+          <w:rFonts w:ascii="Times New Roman" w:hAnsi="Times New Roman"/>
+          <w:i/>
+          <w:sz w:val="28"/>
+        </w:rPr>
+      </w:pPr>
+    </w:p>
+    <w:p>
+      <w:pPr>
+        <w:rPr>
+          <w:rFonts w:ascii="Times New Roman" w:hAnsi="Times New Roman"/>
+          <w:b/>
+          <w:i/>
+          <w:sz w:val="28"/>
+        </w:rPr>
+      </w:pPr>
+      <w:r>
+        <w:rPr>
+          <w:rFonts w:ascii="Times New Roman" w:hAnsi="Times New Roman"/>
+          <w:i/>
+          <w:sz w:val="28"/>
+        </w:rPr>
+        <w:t xml:space="preserve">                                           </w:t>
+      </w:r>
+      <w:r>
+        <w:rPr>
+          <w:rFonts w:ascii="Times New Roman" w:hAnsi="Times New Roman"/>
+          <w:b/>
+          <w:i/>
+          <w:sz w:val="28"/>
+        </w:rPr>
+        <w:t>{{canBoTDVT}}</w:t>
       </w:r>
     </w:p>
     <w:p>

</xml_diff>

<commit_message>
hoan thanh table thu nhap du kien
</commit_message>
<xml_diff>
--- a/src/main/resources/templates/BaoCaoDeNghiGiaiNganKiemGiayNhanNo.docx
+++ b/src/main/resources/templates/BaoCaoDeNghiGiaiNganKiemGiayNhanNo.docx
@@ -229,7 +229,6 @@
           <w:sz w:val="28"/>
         </w:rPr>
       </w:pPr>
-      <w:bookmarkStart w:id="0" w:name="_GoBack"/>
       <w:r>
         <w:rPr>
           <w:rFonts w:ascii="Times New Roman" w:hAnsi="Times New Roman"/>
@@ -260,7 +259,6 @@
         <w:t>.</w:t>
       </w:r>
     </w:p>
-    <w:bookmarkEnd w:id="0"/>
     <w:p>
       <w:pPr>
         <w:pStyle w:val="ListParagraph"/>
@@ -681,14 +679,16 @@
           <w:rFonts w:ascii="Times New Roman" w:hAnsi="Times New Roman"/>
           <w:sz w:val="28"/>
         </w:rPr>
-        <w:t>ng: {{mdvay</w:t>
-      </w:r>
-      <w:r>
-        <w:rPr>
-          <w:rFonts w:ascii="Times New Roman" w:hAnsi="Times New Roman"/>
-          <w:sz w:val="28"/>
-        </w:rPr>
-        <w:t>}}.</w:t>
+        <w:t>ng: {{mdvay}}</w:t>
+      </w:r>
+      <w:bookmarkStart w:id="0" w:name="_GoBack"/>
+      <w:bookmarkEnd w:id="0"/>
+      <w:r>
+        <w:rPr>
+          <w:rFonts w:ascii="Times New Roman" w:hAnsi="Times New Roman"/>
+          <w:sz w:val="28"/>
+        </w:rPr>
+        <w:t>.</w:t>
       </w:r>
     </w:p>
     <w:p>

</xml_diff>